<commit_message>
docs: generado manual_usuario.docx con las nuevas capturas
</commit_message>
<xml_diff>
--- a/manual_usuario.docx
+++ b/manual_usuario.docx
@@ -7,10 +7,10 @@
         <w:pStyle w:val="Title"/>
       </w:pPr>
       <w:r>
-        <w:t xml:space="preserve">Manual de Usuario - TechFlow Solutions</w:t>
-      </w:r>
-    </w:p>
-    <w:bookmarkStart w:id="56" w:name="manual-de-usuario"/>
+        <w:t xml:space="preserve">TechFlow Solutions - Manual de Usuario</w:t>
+      </w:r>
+    </w:p>
+    <w:bookmarkStart w:id="62" w:name="manual-de-usuario"/>
     <w:p>
       <w:pPr>
         <w:pStyle w:val="Heading1"/>
@@ -777,7 +777,7 @@
       <w:r>
         <w:drawing>
           <wp:inline>
-            <wp:extent cx="5334000" cy="3000375"/>
+            <wp:extent cx="5334000" cy="2884505"/>
             <wp:effectExtent b="0" l="0" r="0" t="0"/>
             <wp:docPr descr="Figura 1 - Página Corporativa de TechFlow Solutions" title="" id="27" name="Picture"/>
             <a:graphic>
@@ -798,7 +798,7 @@
                   <pic:spPr bwMode="auto">
                     <a:xfrm>
                       <a:off x="0" y="0"/>
-                      <a:ext cx="5334000" cy="3000375"/>
+                      <a:ext cx="5334000" cy="2884505"/>
                     </a:xfrm>
                     <a:prstGeom prst="rect">
                       <a:avLst/>
@@ -1039,14 +1039,14 @@
       <w:r>
         <w:drawing>
           <wp:inline>
-            <wp:extent cx="5334000" cy="3000375"/>
+            <wp:extent cx="5334000" cy="4400880"/>
             <wp:effectExtent b="0" l="0" r="0" t="0"/>
             <wp:docPr descr="Figura 2 - Login del portal TechFlow Solutions" title="" id="31" name="Picture"/>
             <a:graphic>
               <a:graphicData uri="http://schemas.openxmlformats.org/drawingml/2006/picture">
                 <pic:pic>
                   <pic:nvPicPr>
-                    <pic:cNvPr descr="imagenes-tfg/portal_login.png" id="32" name="Picture"/>
+                    <pic:cNvPr descr="imagenes-tfg/login.png" id="32" name="Picture"/>
                     <pic:cNvPicPr>
                       <a:picLocks noChangeArrowheads="1" noChangeAspect="1"/>
                     </pic:cNvPicPr>
@@ -1060,7 +1060,7 @@
                   <pic:spPr bwMode="auto">
                     <a:xfrm>
                       <a:off x="0" y="0"/>
-                      <a:ext cx="5334000" cy="3000375"/>
+                      <a:ext cx="5334000" cy="4400880"/>
                     </a:xfrm>
                     <a:prstGeom prst="rect">
                       <a:avLst/>
@@ -1096,7 +1096,7 @@
           <w:i/>
           <w:iCs/>
         </w:rPr>
-        <w:t xml:space="preserve">Figura 2. Formulario de autenticación del portal corporativo (login.php). Muestra el panel administrativo del usuario PMO en la sesión activa.</w:t>
+        <w:t xml:space="preserve">Figura 2. Formulario de autenticación del portal corporativo (login.php).</w:t>
       </w:r>
     </w:p>
     <w:bookmarkStart w:id="33" w:name="pasos-para-iniciar-sesión"/>
@@ -1515,7 +1515,7 @@
       <w:r>
         <w:drawing>
           <wp:inline>
-            <wp:extent cx="5334000" cy="3000375"/>
+            <wp:extent cx="5334000" cy="3765176"/>
             <wp:effectExtent b="0" l="0" r="0" t="0"/>
             <wp:docPr descr="Figura 3 - Panel del cliente con proyectos y tickets" title="" id="37" name="Picture"/>
             <a:graphic>
@@ -1536,7 +1536,7 @@
                   <pic:spPr bwMode="auto">
                     <a:xfrm>
                       <a:off x="0" y="0"/>
-                      <a:ext cx="5334000" cy="3000375"/>
+                      <a:ext cx="5334000" cy="3765176"/>
                     </a:xfrm>
                     <a:prstGeom prst="rect">
                       <a:avLst/>
@@ -1912,7 +1912,7 @@
     </w:p>
     <w:bookmarkEnd w:id="40"/>
     <w:bookmarkEnd w:id="41"/>
-    <w:bookmarkStart w:id="43" w:name="crear-una-nueva-incidencia"/>
+    <w:bookmarkStart w:id="46" w:name="crear-una-nueva-incidencia"/>
     <w:p>
       <w:pPr>
         <w:pStyle w:val="Heading2"/>
@@ -2025,7 +2025,86 @@
         <w:t xml:space="preserve">.</w:t>
       </w:r>
     </w:p>
-    <w:bookmarkStart w:id="42" w:name="X1049a65d39edc0c2be81e5830225e3ca28be111"/>
+    <w:p>
+      <w:pPr>
+        <w:pStyle w:val="FirstParagraph"/>
+      </w:pPr>
+      <w:r>
+        <w:rPr>
+          <w:b/>
+          <w:bCs/>
+        </w:rPr>
+        <w:t xml:space="preserve">Figura 4: Formulario de Nueva Incidencia</w:t>
+      </w:r>
+    </w:p>
+    <w:p>
+      <w:pPr>
+        <w:pStyle w:val="CaptionedFigure"/>
+      </w:pPr>
+      <w:r>
+        <w:drawing>
+          <wp:inline>
+            <wp:extent cx="5334000" cy="3177528"/>
+            <wp:effectExtent b="0" l="0" r="0" t="0"/>
+            <wp:docPr descr="Figura 4 - Formulario de nueva incidencia" title="" id="43" name="Picture"/>
+            <a:graphic>
+              <a:graphicData uri="http://schemas.openxmlformats.org/drawingml/2006/picture">
+                <pic:pic>
+                  <pic:nvPicPr>
+                    <pic:cNvPr descr="imagenes-tfg/cliente_reportar_incidencia_it.png" id="44" name="Picture"/>
+                    <pic:cNvPicPr>
+                      <a:picLocks noChangeArrowheads="1" noChangeAspect="1"/>
+                    </pic:cNvPicPr>
+                  </pic:nvPicPr>
+                  <pic:blipFill>
+                    <a:blip r:embed="rId42"/>
+                    <a:stretch>
+                      <a:fillRect/>
+                    </a:stretch>
+                  </pic:blipFill>
+                  <pic:spPr bwMode="auto">
+                    <a:xfrm>
+                      <a:off x="0" y="0"/>
+                      <a:ext cx="5334000" cy="3177528"/>
+                    </a:xfrm>
+                    <a:prstGeom prst="rect">
+                      <a:avLst/>
+                    </a:prstGeom>
+                    <a:noFill/>
+                    <a:ln w="9525">
+                      <a:noFill/>
+                      <a:headEnd/>
+                      <a:tailEnd/>
+                    </a:ln>
+                  </pic:spPr>
+                </pic:pic>
+              </a:graphicData>
+            </a:graphic>
+          </wp:inline>
+        </w:drawing>
+      </w:r>
+    </w:p>
+    <w:p>
+      <w:pPr>
+        <w:pStyle w:val="ImageCaption"/>
+      </w:pPr>
+      <w:r>
+        <w:t xml:space="preserve">Figura 4 - Formulario de nueva incidencia</w:t>
+      </w:r>
+    </w:p>
+    <w:p>
+      <w:pPr>
+        <w:pStyle w:val="BodyText"/>
+      </w:pPr>
+      <w:r>
+        <w:rPr>
+          <w:i/>
+          <w:iCs/>
+        </w:rPr>
+        <w:t xml:space="preserve">Figura 4. Formulario para el reporte de nuevas incidencias de soporte técnico desde el perfil del cliente.</w:t>
+      </w:r>
+    </w:p>
+    <w:bookmarkStart w:id="45" w:name="X1049a65d39edc0c2be81e5830225e3ca28be111"/>
     <w:p>
       <w:pPr>
         <w:pStyle w:val="Heading3"/>
@@ -2377,9 +2456,9 @@
         </w:pict>
       </w:r>
     </w:p>
-    <w:bookmarkEnd w:id="42"/>
-    <w:bookmarkEnd w:id="43"/>
-    <w:bookmarkStart w:id="50" w:name="X09393ed9763a811e69f7aaf23c4e65f92cda58e"/>
+    <w:bookmarkEnd w:id="45"/>
+    <w:bookmarkEnd w:id="46"/>
+    <w:bookmarkStart w:id="53" w:name="X09393ed9763a811e69f7aaf23c4e65f92cda58e"/>
     <w:p>
       <w:pPr>
         <w:pStyle w:val="Heading2"/>
@@ -2405,7 +2484,7 @@
           <w:b/>
           <w:bCs/>
         </w:rPr>
-        <w:t xml:space="preserve">Figura 4: Cuadro de Mando Administrativo del Personal TechFlow</w:t>
+        <w:t xml:space="preserve">Figura 5: Cuadro de Mando Administrativo del Personal TechFlow</w:t>
       </w:r>
     </w:p>
     <w:p>
@@ -2415,20 +2494,20 @@
       <w:r>
         <w:drawing>
           <wp:inline>
-            <wp:extent cx="5334000" cy="3000375"/>
+            <wp:extent cx="5334000" cy="3088303"/>
             <wp:effectExtent b="0" l="0" r="0" t="0"/>
-            <wp:docPr descr="Figura 4 - Cuadro de mando PMO con KPIs y tabla de tickets" title="" id="45" name="Picture"/>
+            <wp:docPr descr="Figura 5 - Cuadro de mando PMO con KPIs y tabla de tickets" title="" id="48" name="Picture"/>
             <a:graphic>
               <a:graphicData uri="http://schemas.openxmlformats.org/drawingml/2006/picture">
                 <pic:pic>
                   <pic:nvPicPr>
-                    <pic:cNvPr descr="imagenes-tfg/cuadro_mando_pmo.png" id="46" name="Picture"/>
+                    <pic:cNvPr descr="imagenes-tfg/cuadro_mando_pmo.png" id="49" name="Picture"/>
                     <pic:cNvPicPr>
                       <a:picLocks noChangeArrowheads="1" noChangeAspect="1"/>
                     </pic:cNvPicPr>
                   </pic:nvPicPr>
                   <pic:blipFill>
-                    <a:blip r:embed="rId44"/>
+                    <a:blip r:embed="rId47"/>
                     <a:stretch>
                       <a:fillRect/>
                     </a:stretch>
@@ -2436,7 +2515,7 @@
                   <pic:spPr bwMode="auto">
                     <a:xfrm>
                       <a:off x="0" y="0"/>
-                      <a:ext cx="5334000" cy="3000375"/>
+                      <a:ext cx="5334000" cy="3088303"/>
                     </a:xfrm>
                     <a:prstGeom prst="rect">
                       <a:avLst/>
@@ -2460,7 +2539,7 @@
         <w:pStyle w:val="ImageCaption"/>
       </w:pPr>
       <w:r>
-        <w:t xml:space="preserve">Figura 4 - Cuadro de mando PMO con KPIs y tabla de tickets</w:t>
+        <w:t xml:space="preserve">Figura 5 - Cuadro de mando PMO con KPIs y tabla de tickets</w:t>
       </w:r>
     </w:p>
     <w:p>
@@ -2472,7 +2551,7 @@
           <w:i/>
           <w:iCs/>
         </w:rPr>
-        <w:t xml:space="preserve">Figura 4. Panel de control del personal (panel_pmo.php). Muestra los KPIs estadísticos en la cabecera y la tabla de gestión global de tickets. Se observan los tickets #1, #2 y #3 con sus respectivos estados:</w:t>
+        <w:t xml:space="preserve">Figura 5. Panel de control del personal (panel_pmo.php). Muestra los KPIs estadísticos en la cabecera y la tabla de gestión global de tickets. Se observan los tickets #1, #2 y #3 con sus respectivos estados:</w:t>
       </w:r>
       <w:r>
         <w:rPr>
@@ -2587,7 +2666,7 @@
         <w:t xml:space="preserve">.</w:t>
       </w:r>
     </w:p>
-    <w:bookmarkStart w:id="47" w:name="X48f644bf5732f36c603bbfecd52c187311d68f1"/>
+    <w:bookmarkStart w:id="50" w:name="X48f644bf5732f36c603bbfecd52c187311d68f1"/>
     <w:p>
       <w:pPr>
         <w:pStyle w:val="Heading3"/>
@@ -2856,8 +2935,8 @@
         </w:tc>
       </w:tr>
     </w:tbl>
-    <w:bookmarkEnd w:id="47"/>
-    <w:bookmarkStart w:id="48" w:name="pestaña-1-soporte-it-buzón-de-tickets"/>
+    <w:bookmarkEnd w:id="50"/>
+    <w:bookmarkStart w:id="51" w:name="pestaña-1-soporte-it-buzón-de-tickets"/>
     <w:p>
       <w:pPr>
         <w:pStyle w:val="Heading3"/>
@@ -3111,8 +3190,8 @@
         <w:t xml:space="preserve">para abrir la ficha completa del ticket</w:t>
       </w:r>
     </w:p>
-    <w:bookmarkEnd w:id="48"/>
-    <w:bookmarkStart w:id="49" w:name="pestaña-2-gestión-de-proyectos-pmo"/>
+    <w:bookmarkEnd w:id="51"/>
+    <w:bookmarkStart w:id="52" w:name="pestaña-2-gestión-de-proyectos-pmo"/>
     <w:p>
       <w:pPr>
         <w:pStyle w:val="Heading3"/>
@@ -3136,9 +3215,9 @@
         </w:pict>
       </w:r>
     </w:p>
-    <w:bookmarkEnd w:id="49"/>
-    <w:bookmarkEnd w:id="50"/>
-    <w:bookmarkStart w:id="53" w:name="gestión-y-seguimiento-de-tickets"/>
+    <w:bookmarkEnd w:id="52"/>
+    <w:bookmarkEnd w:id="53"/>
+    <w:bookmarkStart w:id="59" w:name="gestión-y-seguimiento-de-tickets"/>
     <w:p>
       <w:pPr>
         <w:pStyle w:val="Heading2"/>
@@ -3235,7 +3314,86 @@
         <w:t xml:space="preserve">Esta vista tiene dos zonas:</w:t>
       </w:r>
     </w:p>
-    <w:bookmarkStart w:id="51" w:name="zona-izquierda-chat-de-seguimiento"/>
+    <w:p>
+      <w:pPr>
+        <w:pStyle w:val="BodyText"/>
+      </w:pPr>
+      <w:r>
+        <w:rPr>
+          <w:b/>
+          <w:bCs/>
+        </w:rPr>
+        <w:t xml:space="preserve">Figura 6: Historial y Gestión de Incidencias</w:t>
+      </w:r>
+    </w:p>
+    <w:p>
+      <w:pPr>
+        <w:pStyle w:val="CaptionedFigure"/>
+      </w:pPr>
+      <w:r>
+        <w:drawing>
+          <wp:inline>
+            <wp:extent cx="5334000" cy="3954590"/>
+            <wp:effectExtent b="0" l="0" r="0" t="0"/>
+            <wp:docPr descr="Figura 6 - Historial y chat de seguimiento" title="" id="55" name="Picture"/>
+            <a:graphic>
+              <a:graphicData uri="http://schemas.openxmlformats.org/drawingml/2006/picture">
+                <pic:pic>
+                  <pic:nvPicPr>
+                    <pic:cNvPr descr="imagenes-tfg/historial_y_gestion_incidencias.png" id="56" name="Picture"/>
+                    <pic:cNvPicPr>
+                      <a:picLocks noChangeArrowheads="1" noChangeAspect="1"/>
+                    </pic:cNvPicPr>
+                  </pic:nvPicPr>
+                  <pic:blipFill>
+                    <a:blip r:embed="rId54"/>
+                    <a:stretch>
+                      <a:fillRect/>
+                    </a:stretch>
+                  </pic:blipFill>
+                  <pic:spPr bwMode="auto">
+                    <a:xfrm>
+                      <a:off x="0" y="0"/>
+                      <a:ext cx="5334000" cy="3954590"/>
+                    </a:xfrm>
+                    <a:prstGeom prst="rect">
+                      <a:avLst/>
+                    </a:prstGeom>
+                    <a:noFill/>
+                    <a:ln w="9525">
+                      <a:noFill/>
+                      <a:headEnd/>
+                      <a:tailEnd/>
+                    </a:ln>
+                  </pic:spPr>
+                </pic:pic>
+              </a:graphicData>
+            </a:graphic>
+          </wp:inline>
+        </w:drawing>
+      </w:r>
+    </w:p>
+    <w:p>
+      <w:pPr>
+        <w:pStyle w:val="ImageCaption"/>
+      </w:pPr>
+      <w:r>
+        <w:t xml:space="preserve">Figura 6 - Historial y chat de seguimiento</w:t>
+      </w:r>
+    </w:p>
+    <w:p>
+      <w:pPr>
+        <w:pStyle w:val="BodyText"/>
+      </w:pPr>
+      <w:r>
+        <w:rPr>
+          <w:i/>
+          <w:iCs/>
+        </w:rPr>
+        <w:t xml:space="preserve">Figura 6. Historial del ticket y chat de seguimiento. Los técnicos pueden actualizar el estado de la incidencia en tiempo real.</w:t>
+      </w:r>
+    </w:p>
+    <w:bookmarkStart w:id="57" w:name="zona-izquierda-chat-de-seguimiento"/>
     <w:p>
       <w:pPr>
         <w:pStyle w:val="Heading3"/>
@@ -3312,8 +3470,8 @@
         <w:t xml:space="preserve">con la fecha y hora exactas.</w:t>
       </w:r>
     </w:p>
-    <w:bookmarkEnd w:id="51"/>
-    <w:bookmarkStart w:id="52" w:name="Xb3e863eb58aa5e23b32bd3ea5fb241e825edf93"/>
+    <w:bookmarkEnd w:id="57"/>
+    <w:bookmarkStart w:id="58" w:name="Xb3e863eb58aa5e23b32bd3ea5fb241e825edf93"/>
     <w:p>
       <w:pPr>
         <w:pStyle w:val="Heading3"/>
@@ -3596,9 +3754,9 @@
         </w:pict>
       </w:r>
     </w:p>
-    <w:bookmarkEnd w:id="52"/>
-    <w:bookmarkEnd w:id="53"/>
-    <w:bookmarkStart w:id="54" w:name="cerrar-sesión"/>
+    <w:bookmarkEnd w:id="58"/>
+    <w:bookmarkEnd w:id="59"/>
+    <w:bookmarkStart w:id="60" w:name="cerrar-sesión"/>
     <w:p>
       <w:pPr>
         <w:pStyle w:val="Heading2"/>
@@ -3712,8 +3870,8 @@
         </w:pict>
       </w:r>
     </w:p>
-    <w:bookmarkEnd w:id="54"/>
-    <w:bookmarkStart w:id="55" w:name="credenciales-de-prueba"/>
+    <w:bookmarkEnd w:id="60"/>
+    <w:bookmarkStart w:id="61" w:name="credenciales-de-prueba"/>
     <w:p>
       <w:pPr>
         <w:pStyle w:val="Heading2"/>
@@ -4014,8 +4172,8 @@
         <w:t xml:space="preserve">Manual generado para el Proyecto Final de Grado Medio SMR · TechFlow Solutions · Mayo 2026</w:t>
       </w:r>
     </w:p>
-    <w:bookmarkEnd w:id="55"/>
-    <w:bookmarkEnd w:id="56"/>
+    <w:bookmarkEnd w:id="61"/>
+    <w:bookmarkEnd w:id="62"/>
     <w:sectPr/>
   </w:body>
 </w:document>

</xml_diff>